<commit_message>
feat(film c01-c06): propagare sectiune SLIDES EXECUTIVE in toate FILM-urile
Fiecare FILM de constructie primeste sectiunea "SLIDES EXECUTIVE · SHOW FINAL
VIDEO" (dupa MANTRA, inainte de WOW), completata cu continutul propriu al
constructiei (exec-emotion + exec-phrase x6), extras din HTML-Video-ul
corespunzator (sursa corectata in V43). Idempotent (skip daca exista deja).

Asa, FILM-ul devine sursa de adevar textuala completa per constructie, cu
sectiunile de rafinare creativa grupate sus.

https://claude.ai/code/session_011hdPJf3hrU8AgLAMEvh9c2
</commit_message>
<xml_diff>
--- a/c01/FILM-Excel-01-Structurare.docx
+++ b/c01/FILM-Excel-01-Structurare.docx
@@ -122,6 +122,313 @@
           <w:sz w:val="20"/>
         </w:rPr>
         <w:t>Înainte de orice calcul, structura.</w:t>
+      </w:r>
+    </w:p>
+    <w:p>
+      <w:r>
+        <w:rPr>
+          <w:b/>
+          <w:color w:val="000000"/>
+          <w:sz w:val="32"/>
+        </w:rPr>
+        <w:t>SLIDES EXECUTIVE · SHOW FINAL VIDEO</w:t>
+      </w:r>
+    </w:p>
+    <w:p>
+      <w:r>
+        <w:rPr>
+          <w:b w:val="0"/>
+          <w:sz w:val="20"/>
+        </w:rPr>
+        <w:t>Cele 6 slide-uri din show-ul executiv de la finalul videoului (recapitulare cinematică, una per etapă). STARE = exec-emotion (2-3 cuvinte). FRAZĂ DE IMPACT = exec-phrase (o frază memorabilă). Sursă pentru slide-urile exec din HTML-Video; editează-le aici și se propagă în machete.</w:t>
+      </w:r>
+    </w:p>
+    <w:p>
+      <w:r>
+        <w:rPr>
+          <w:b/>
+          <w:color w:val="000000"/>
+          <w:sz w:val="26"/>
+        </w:rPr>
+        <w:t>SLIDE EXEC 1 · REALITATE</w:t>
+      </w:r>
+    </w:p>
+    <w:p>
+      <w:r>
+        <w:rPr>
+          <w:b/>
+          <w:color w:val="333333"/>
+          <w:sz w:val="22"/>
+        </w:rPr>
+        <w:t>STARE (exec-emotion)</w:t>
+      </w:r>
+    </w:p>
+    <w:p>
+      <w:r>
+        <w:rPr>
+          <w:b w:val="0"/>
+          <w:sz w:val="20"/>
+        </w:rPr>
+        <w:t>Adevărul brutal</w:t>
+      </w:r>
+    </w:p>
+    <w:p>
+      <w:r>
+        <w:rPr>
+          <w:b/>
+          <w:color w:val="333333"/>
+          <w:sz w:val="22"/>
+        </w:rPr>
+        <w:t>FRAZĂ DE IMPACT (exec-phrase)</w:t>
+      </w:r>
+    </w:p>
+    <w:p>
+      <w:r>
+        <w:rPr>
+          <w:b w:val="0"/>
+          <w:sz w:val="20"/>
+        </w:rPr>
+        <w:t>Te uiți la un tabel. Astăzi am descoperit de ce nu era unul.</w:t>
+      </w:r>
+    </w:p>
+    <w:p>
+      <w:r>
+        <w:rPr>
+          <w:b/>
+          <w:color w:val="000000"/>
+          <w:sz w:val="26"/>
+        </w:rPr>
+        <w:t>SLIDE EXEC 2 · INVESTIGAȚIE</w:t>
+      </w:r>
+    </w:p>
+    <w:p>
+      <w:r>
+        <w:rPr>
+          <w:b/>
+          <w:color w:val="333333"/>
+          <w:sz w:val="22"/>
+        </w:rPr>
+        <w:t>STARE (exec-emotion)</w:t>
+      </w:r>
+    </w:p>
+    <w:p>
+      <w:r>
+        <w:rPr>
+          <w:b w:val="0"/>
+          <w:sz w:val="20"/>
+        </w:rPr>
+        <w:t>Suspiciune controlată</w:t>
+      </w:r>
+    </w:p>
+    <w:p>
+      <w:r>
+        <w:rPr>
+          <w:b/>
+          <w:color w:val="333333"/>
+          <w:sz w:val="22"/>
+        </w:rPr>
+        <w:t>FRAZĂ DE IMPACT (exec-phrase)</w:t>
+      </w:r>
+    </w:p>
+    <w:p>
+      <w:r>
+        <w:rPr>
+          <w:b w:val="0"/>
+          <w:sz w:val="20"/>
+        </w:rPr>
+        <w:t>AI-ul nu repară. AI-ul mărturisește.</w:t>
+      </w:r>
+    </w:p>
+    <w:p>
+      <w:r>
+        <w:rPr>
+          <w:b/>
+          <w:color w:val="000000"/>
+          <w:sz w:val="26"/>
+        </w:rPr>
+        <w:t>SLIDE EXEC 3 · TRANSFORMARE</w:t>
+      </w:r>
+    </w:p>
+    <w:p>
+      <w:r>
+        <w:rPr>
+          <w:b/>
+          <w:color w:val="333333"/>
+          <w:sz w:val="22"/>
+        </w:rPr>
+        <w:t>STARE (exec-emotion)</w:t>
+      </w:r>
+    </w:p>
+    <w:p>
+      <w:r>
+        <w:rPr>
+          <w:b w:val="0"/>
+          <w:sz w:val="20"/>
+        </w:rPr>
+        <w:t>Reconstrucție chirurgicală</w:t>
+      </w:r>
+    </w:p>
+    <w:p>
+      <w:r>
+        <w:rPr>
+          <w:b/>
+          <w:color w:val="333333"/>
+          <w:sz w:val="22"/>
+        </w:rPr>
+        <w:t>FRAZĂ DE IMPACT (exec-phrase)</w:t>
+      </w:r>
+    </w:p>
+    <w:p>
+      <w:r>
+        <w:rPr>
+          <w:b w:val="0"/>
+          <w:sz w:val="20"/>
+        </w:rPr>
+        <w:t>Nu am reparat cifre. Am reconstruit infrastructura.</w:t>
+      </w:r>
+    </w:p>
+    <w:p>
+      <w:r>
+        <w:rPr>
+          <w:b/>
+          <w:color w:val="000000"/>
+          <w:sz w:val="26"/>
+        </w:rPr>
+        <w:t>SLIDE EXEC 4 · VERIFICARE</w:t>
+      </w:r>
+    </w:p>
+    <w:p>
+      <w:r>
+        <w:rPr>
+          <w:b/>
+          <w:color w:val="333333"/>
+          <w:sz w:val="22"/>
+        </w:rPr>
+        <w:t>STARE (exec-emotion)</w:t>
+      </w:r>
+    </w:p>
+    <w:p>
+      <w:r>
+        <w:rPr>
+          <w:b w:val="0"/>
+          <w:sz w:val="20"/>
+        </w:rPr>
+        <w:t>Încredere câștigată</w:t>
+      </w:r>
+    </w:p>
+    <w:p>
+      <w:r>
+        <w:rPr>
+          <w:b/>
+          <w:color w:val="333333"/>
+          <w:sz w:val="22"/>
+        </w:rPr>
+        <w:t>FRAZĂ DE IMPACT (exec-phrase)</w:t>
+      </w:r>
+    </w:p>
+    <w:p>
+      <w:r>
+        <w:rPr>
+          <w:b w:val="0"/>
+          <w:sz w:val="20"/>
+        </w:rPr>
+        <w:t>Un proces care a rulat nu este un proces care a funcționat.</w:t>
+      </w:r>
+    </w:p>
+    <w:p>
+      <w:r>
+        <w:rPr>
+          <w:b/>
+          <w:color w:val="000000"/>
+          <w:sz w:val="26"/>
+        </w:rPr>
+        <w:t>SLIDE EXEC 5 · STABILIZARE</w:t>
+      </w:r>
+    </w:p>
+    <w:p>
+      <w:r>
+        <w:rPr>
+          <w:b/>
+          <w:color w:val="333333"/>
+          <w:sz w:val="22"/>
+        </w:rPr>
+        <w:t>STARE (exec-emotion)</w:t>
+      </w:r>
+    </w:p>
+    <w:p>
+      <w:r>
+        <w:rPr>
+          <w:b w:val="0"/>
+          <w:sz w:val="20"/>
+        </w:rPr>
+        <w:t>Permanență operațională</w:t>
+      </w:r>
+    </w:p>
+    <w:p>
+      <w:r>
+        <w:rPr>
+          <w:b/>
+          <w:color w:val="333333"/>
+          <w:sz w:val="22"/>
+        </w:rPr>
+        <w:t>FRAZĂ DE IMPACT (exec-phrase)</w:t>
+      </w:r>
+    </w:p>
+    <w:p>
+      <w:r>
+        <w:rPr>
+          <w:b w:val="0"/>
+          <w:sz w:val="20"/>
+        </w:rPr>
+        <w:t>Un export curat astăzi este un export contaminat luna viitoare. Dacă nu există mecanism.</w:t>
+      </w:r>
+    </w:p>
+    <w:p>
+      <w:r>
+        <w:rPr>
+          <w:b/>
+          <w:color w:val="000000"/>
+          <w:sz w:val="26"/>
+        </w:rPr>
+        <w:t>SLIDE EXEC 6 · CONFIRMARE</w:t>
+      </w:r>
+    </w:p>
+    <w:p>
+      <w:r>
+        <w:rPr>
+          <w:b/>
+          <w:color w:val="333333"/>
+          <w:sz w:val="22"/>
+        </w:rPr>
+        <w:t>STARE (exec-emotion)</w:t>
+      </w:r>
+    </w:p>
+    <w:p>
+      <w:r>
+        <w:rPr>
+          <w:b w:val="0"/>
+          <w:sz w:val="20"/>
+        </w:rPr>
+        <w:t>Predarea către viitor</w:t>
+      </w:r>
+    </w:p>
+    <w:p>
+      <w:r>
+        <w:rPr>
+          <w:b/>
+          <w:color w:val="333333"/>
+          <w:sz w:val="22"/>
+        </w:rPr>
+        <w:t>FRAZĂ DE IMPACT (exec-phrase)</w:t>
+      </w:r>
+    </w:p>
+    <w:p>
+      <w:r>
+        <w:rPr>
+          <w:b w:val="0"/>
+          <w:sz w:val="20"/>
+        </w:rPr>
+        <w:t>Arată ca tabel. De data asta, chiar este.</w:t>
       </w:r>
     </w:p>
     <w:p>

</xml_diff>

<commit_message>
fix(film c01-c08): elimin "operatorul" din tot sistemul + C07 F5/Suma
Rafinari ARHITECT (feedback pe livrabile):
1. "Operatorul" eliminat DEFINITIV din toate cele 8 FILM-uri (~125 ocurente):
   voce impersonala/"noi" (Deschidem, Confirmam martorul, Citim...), rol "NOI"
   in loc de "OPERATORUL", eticheta "(SEMNATURA)" nu "(SEMNATURA OPERATOR)".
2. C07 F5 "SEZON & SAPTAMANA" (suna a doua exemple) -> "MEMORIA CICLICA"
   (conceptual, intareste obiectul memorie). HTML anomaly-title + FILM.
3. "Suma conservata DELTA 0" scoasa din identitatea FILM C07/C08 (mostenire T1)
   -> "Memoria setului este completa" / "Harta ecosistemului este completa".
   Conservarea sumei ramane in CONTROL_FINAL al Excel-ului (invariant de date).

audit_sync 80/80 ZERO DRIFT.

https://claude.ai/code/session_011hdPJf3hrU8AgLAMEvh9c2
</commit_message>
<xml_diff>
--- a/c01/FILM-Excel-01-Structurare.docx
+++ b/c01/FILM-Excel-01-Structurare.docx
@@ -159,7 +159,7 @@
           <w:color w:val="000000"/>
           <w:sz w:val="26"/>
         </w:rPr>
-        <w:t>MOTTO (SEMNĂTURĂ OPERATOR)</w:t>
+        <w:t>MOTTO (SEMNĂTURĂ)</w:t>
       </w:r>
     </w:p>
     <w:p>
@@ -527,7 +527,7 @@
           <w:rFonts w:ascii="Calibri" w:hAnsi="Calibri"/>
           <w:sz w:val="20"/>
         </w:rPr>
-        <w:t>Conține 7 fenomene structurale demonstrabil prezente, toate vizibile sub forma de aparență de tabel curat. Construcția C01 le predă pe rând operatorului ca să le poată recunoaște la prima privire în orice export ERP viitor.</w:t>
+        <w:t>Conține 7 fenomene structurale demonstrabil prezente, toate vizibile sub forma de aparență de tabel curat. Construcția C01 ni le predă pe rând ca să le putem recunoaște la prima privire în orice export ERP viitor.</w:t>
       </w:r>
     </w:p>
     <w:p>
@@ -590,7 +590,7 @@
           <w:rFonts w:ascii="Calibri" w:hAnsi="Calibri"/>
           <w:sz w:val="20"/>
         </w:rPr>
-        <w:t>Furnizează unelte moderne (AGGREGATE) care fac vizibilă contaminarea structurală fără să o repare. Aplică transformările cerute de operator, una câte una.</w:t>
+        <w:t>Furnizează unelte moderne (AGGREGATE) care fac vizibilă contaminarea structurală fără să o repare. Aplică transformările cerute de noi, una câte una.</w:t>
       </w:r>
     </w:p>
     <w:p>
@@ -603,7 +603,7 @@
           <w:color w:val="333333"/>
           <w:sz w:val="22"/>
         </w:rPr>
-        <w:t>OPERATORUL</w:t>
+        <w:t>NOI</w:t>
       </w:r>
     </w:p>
     <w:p>
@@ -615,7 +615,7 @@
           <w:rFonts w:ascii="Calibri" w:hAnsi="Calibri"/>
           <w:sz w:val="20"/>
         </w:rPr>
-        <w:t>Cere demonstrația. Recunoaște fiecare fenomen ca specie. Acceptă transformarea controlată. Nu reconstruiește din nou, doar face structura controlabilă.</w:t>
+        <w:t>Cerem demonstrația. Recunoaștem fiecare fenomen ca specie. Acceptăm transformarea controlată. Nu reconstruiește din nou, doar face structura controlabilă.</w:t>
       </w:r>
     </w:p>
     <w:p>
@@ -879,7 +879,7 @@
           <w:rFonts w:ascii="Calibri" w:hAnsi="Calibri"/>
           <w:sz w:val="20"/>
         </w:rPr>
-        <w:t>Operatorul deschide fișierul, recunoaște aparența impecabilă, fixează intenția de control.</w:t>
+        <w:t>Deschidem fișierul, recunoaște aparența impecabilă, fixează intenția de control.</w:t>
       </w:r>
     </w:p>
     <w:p>
@@ -1005,7 +1005,7 @@
           <w:rFonts w:ascii="Calibri" w:hAnsi="Calibri"/>
           <w:sz w:val="20"/>
         </w:rPr>
-        <w:t>Operatorul rostește martorul: "Suma de control vizibilă: șapte milioane nouă sute optzeci și șase de mii nouăsprezece lei. Verific dacă această sumă este ce arată tabelul sau ce conține tabelul."</w:t>
+        <w:t>Confirmăm martorul: "Suma de control vizibilă: șapte milioane nouă sute optzeci și șase de mii nouăsprezece lei. Verific dacă această sumă este ce arată tabelul sau ce conține tabelul."</w:t>
       </w:r>
     </w:p>
     <w:p>
@@ -1182,7 +1182,7 @@
           <w:rFonts w:ascii="Calibri" w:hAnsi="Calibri"/>
           <w:sz w:val="20"/>
         </w:rPr>
-        <w:t>Copilot deschis în panoul lateral. Operatorul lipește promptul 1 (INSTRUMENT DE INVESTIGAȚIE). AI rulează. Datele nu se schimbă. Raportul apare în chat: 7 fenomene structurale identificate, cuantificate, localizate.</w:t>
+        <w:t>Copilot deschis în panoul lateral. Lipim promptul 1 (INSTRUMENT DE INVESTIGAȚIE). AI rulează. Datele nu se schimbă. Raportul apare în chat: 7 fenomene structurale identificate, cuantificate, localizate.</w:t>
       </w:r>
     </w:p>
     <w:p>
@@ -1232,7 +1232,7 @@
           <w:rFonts w:ascii="Calibri" w:hAnsi="Calibri"/>
           <w:sz w:val="20"/>
         </w:rPr>
-        <w:t>Operatorul citește raportul cu voce tare: "Șapte fenomene structurale identificate. Șase contaminate. Unul leac. Acum știu ce întreb tabelul."</w:t>
+        <w:t>Citim raportul cu voce tare: "Șapte fenomene structurale identificate. Șase contaminate. Unul leac. Acum știu ce întreb tabelul."</w:t>
       </w:r>
     </w:p>
     <w:p>
@@ -1333,7 +1333,7 @@
           <w:rFonts w:ascii="Calibri" w:hAnsi="Calibri"/>
           <w:sz w:val="20"/>
         </w:rPr>
-        <w:t>Operatorul aplică promptul 2 (INSTRUMENT DE TRANSFORMARE CONTROLATĂ). AI neutralizează fiecare fenomen contaminat, păstrează AGGREGATE ca leac modern. Zero rânduri suprimate ne-explicit.</w:t>
+        <w:t>Aplicăm promptul 2 (INSTRUMENT DE TRANSFORMARE CONTROLATĂ). AI neutralizează fiecare fenomen contaminat, păstrează AGGREGATE ca leac modern. Zero rânduri suprimate ne-explicit.</w:t>
       </w:r>
     </w:p>
     <w:p>
@@ -1409,7 +1409,7 @@
           <w:rFonts w:ascii="Calibri" w:hAnsi="Calibri"/>
           <w:sz w:val="20"/>
         </w:rPr>
-        <w:t>Promptul 2 lipit în Copilot. AI propune transformările pas cu pas. Operatorul confirmă fiecare. Header devine 1 rând. 5 rânduri parazite (4 SUBTOTAL + 1 TOTAL) eliminate. 53 blank eliminate. Coloana J devine vizibilă. Cell-merging desfăcut. AutoFilter dezactivat. SUM tradițional înlocuit cu AGGREGATE.</w:t>
+        <w:t>Promptul 2 lipit în Copilot. AI propune transformările pas cu pas. Confirmăm fiecare. Header devine 1 rând. 5 rânduri parazite (4 SUBTOTAL + 1 TOTAL) eliminate. 53 blank eliminate. Coloana J devine vizibilă. Cell-merging desfăcut. AutoFilter dezactivat. SUM tradițional înlocuit cu AGGREGATE.</w:t>
       </w:r>
     </w:p>
     <w:p>
@@ -1434,7 +1434,7 @@
           <w:rFonts w:ascii="Calibri" w:hAnsi="Calibri"/>
           <w:sz w:val="20"/>
         </w:rPr>
-        <w:t>AI traduce intenția operatorului în pași Excel concreți. Confirmă efectul fiecărui pas. Nu inițiază transformări neînțelese de operator.</w:t>
+        <w:t>AI traduce intenția noastră în pași Excel concreți. Confirmă efectul fiecărui pas. Nu inițiază transformări pe care nu le înțelegem.</w:t>
       </w:r>
     </w:p>
     <w:p>
@@ -1459,7 +1459,7 @@
           <w:rFonts w:ascii="Calibri" w:hAnsi="Calibri"/>
           <w:sz w:val="20"/>
         </w:rPr>
-        <w:t>Operatorul rostește martorul după fiecare pas major: "Header e acum un singur rând. Pot filtra. Pot sorta. Pot lua data ca data."</w:t>
+        <w:t>Confirmăm martorul după fiecare pas major: "Header e acum un singur rând. Pot filtra. Pot sorta. Pot lua data ca data."</w:t>
       </w:r>
     </w:p>
     <w:p>
@@ -1636,7 +1636,7 @@
           <w:rFonts w:ascii="Calibri" w:hAnsi="Calibri"/>
           <w:sz w:val="20"/>
         </w:rPr>
-        <w:t>Cursor pe celula goală sub coloana valoare_neta. Operator scrie =AGGREGATE(9,5,...). Cifra apare: 7.986.019,38 lei. Egal cu martorul inițial. Confirmare.</w:t>
+        <w:t>Cursor pe celula goală sub coloana valoare_neta. Scriem =AGGREGATE(9,5,...). Cifra apare: 7.986.019,38 lei. Egal cu martorul inițial. Confirmare.</w:t>
       </w:r>
     </w:p>
     <w:p>
@@ -1686,7 +1686,7 @@
           <w:rFonts w:ascii="Calibri" w:hAnsi="Calibri"/>
           <w:sz w:val="20"/>
         </w:rPr>
-        <w:t>Operatorul citește cu voce tare: "Șapte milioane nouă sute optzeci și șase de mii nouăsprezece lei și treizeci și opt de bani. Egal cu martorul. Transformarea e neutră semantic."</w:t>
+        <w:t>Citim cu voce tare: "Șapte milioane nouă sute optzeci și șase de mii nouăsprezece lei și treizeci și opt de bani. Egal cu martorul. Transformarea e neutră semantic."</w:t>
       </w:r>
     </w:p>
     <w:p>
@@ -1863,7 +1863,7 @@
           <w:rFonts w:ascii="Calibri" w:hAnsi="Calibri"/>
           <w:sz w:val="20"/>
         </w:rPr>
-        <w:t>Operator deschide Data → From File → fișierul Excel original. Power Query Editor pornește. Promoted Headers, Removed Top Rows (3), Removed SUBTOTAL Rows, Removed TOTAL Row, Removed Blank Rows, Unhide Column. Fluxul are 6 Applied Steps vizibile lateral. Close &amp; Load.</w:t>
+        <w:t>Deschidem Data → From File → fișierul Excel original. Power Query Editor pornește. Promoted Headers, Removed Top Rows (3), Removed SUBTOTAL Rows, Removed TOTAL Row, Removed Blank Rows, Unhide Column. Fluxul are 6 Applied Steps vizibile lateral. Close &amp; Load.</w:t>
       </w:r>
     </w:p>
     <w:p>
@@ -1888,7 +1888,7 @@
           <w:rFonts w:ascii="Calibri" w:hAnsi="Calibri"/>
           <w:sz w:val="20"/>
         </w:rPr>
-        <w:t>AI nu intervine. Power Query are propriul model declarativ. Operatorul învață sintaxa fluxului.</w:t>
+        <w:t>AI nu intervine. Power Query are propriul model declarativ. Învățăm sintaxa fluxului.</w:t>
       </w:r>
     </w:p>
     <w:p>
@@ -1913,7 +1913,7 @@
           <w:rFonts w:ascii="Calibri" w:hAnsi="Calibri"/>
           <w:sz w:val="20"/>
         </w:rPr>
-        <w:t>Operatorul rostește martorul: "Fluxul e salvat. La luna viitoare apăs Refresh All. Cele 6 transformări se re-aplică pe noul export."</w:t>
+        <w:t>Confirmăm martorul: "Fluxul e salvat. La luna viitoare apăs Refresh All. Cele 6 transformări se re-aplică pe noul export."</w:t>
       </w:r>
     </w:p>
     <w:p>
@@ -2039,7 +2039,7 @@
           <w:rFonts w:ascii="Calibri" w:hAnsi="Calibri"/>
           <w:sz w:val="20"/>
         </w:rPr>
-        <w:t>Predare conștientă. Operatorul nu confundă "tabel curat structural" cu "date corecte operațional". Asta vine la C02.</w:t>
+        <w:t>Predare conștientă. Nu confundăm "tabel curat structural" cu "date corecte operațional". Asta vine la C02.</w:t>
       </w:r>
     </w:p>
     <w:p>
@@ -2140,7 +2140,7 @@
           <w:rFonts w:ascii="Calibri" w:hAnsi="Calibri"/>
           <w:sz w:val="20"/>
         </w:rPr>
-        <w:t>Operatorul rostește semnătura: "Nu am reconstruit tabelul. L-am făcut controlabil. Suma de control: șapte milioane nouă sute optzeci și șase de mii nouăsprezece lei. Predat către C02."</w:t>
+        <w:t>Rostim semnătura: "Nu am reconstruit tabelul. L-am făcut controlabil. Suma de control: șapte milioane nouă sute optzeci și șase de mii nouăsprezece lei. Predat către C02."</w:t>
       </w:r>
     </w:p>
     <w:p>

</xml_diff>

<commit_message>
feat(c01): PROTOTIP hero pedagogic + sectiune BRIEF STUDIU in FILM
FILM C01: adaugat MICRO-BRIEF (sub INTRIGA) + sectiune noua BRIEF STUDIU
(INTREBAREA CONSTRUCTIEI / DE CE CONTEAZA / INAINTE / DUPA / CE VEI OBTINE),
intre IDENTITATE si SLIDES EXECUTIVE - sursa unica (video+study+narator).
HTML-Studiu C01: hero nou in 9 blocuri (creativ placeholder, titlu, intrebare,
intriga, micro-brief, miza, inainte->dupa, ce vei obtine, start) + CSS dedicat.
Prototip pentru reactie; NEpropagat inca la template/C02-C08.
</commit_message>
<xml_diff>
--- a/c01/FILM-Excel-01-Structurare.docx
+++ b/c01/FILM-Excel-01-Structurare.docx
@@ -84,6 +84,31 @@
           <w:color w:val="000000"/>
           <w:sz w:val="26"/>
         </w:rPr>
+        <w:t>MICRO-BRIEF</w:t>
+      </w:r>
+    </w:p>
+    <w:p>
+      <w:pPr>
+        <w:spacing w:after="80"/>
+      </w:pPr>
+      <w:r>
+        <w:rPr>
+          <w:rFonts w:ascii="Calibri" w:hAnsi="Calibri"/>
+          <w:sz w:val="20"/>
+        </w:rPr>
+        <w:t>Un export poate avea aspectul unui tabel Excel și totuși să nu respecte regulile unui tabel real. În această construcție demonstrăm diferența dintre aparență și structură.</w:t>
+      </w:r>
+    </w:p>
+    <w:p>
+      <w:pPr>
+        <w:spacing w:before="200" w:after="80"/>
+      </w:pPr>
+      <w:r>
+        <w:rPr>
+          <w:b/>
+          <w:color w:val="000000"/>
+          <w:sz w:val="26"/>
+        </w:rPr>
         <w:t>MIZA</w:t>
       </w:r>
     </w:p>
@@ -172,6 +197,249 @@
           <w:sz w:val="20"/>
         </w:rPr>
         <w:t>Nu reconstruim tabelul. Îl facem controlabil.</w:t>
+      </w:r>
+    </w:p>
+    <w:p>
+      <w:r>
+        <w:rPr>
+          <w:b/>
+          <w:color w:val="000000"/>
+          <w:sz w:val="32"/>
+        </w:rPr>
+        <w:t>BRIEF STUDIU · PEDAGOGIC</w:t>
+      </w:r>
+    </w:p>
+    <w:p>
+      <w:pPr>
+        <w:spacing w:before="200" w:after="80"/>
+      </w:pPr>
+      <w:r>
+        <w:rPr>
+          <w:b/>
+          <w:color w:val="000000"/>
+          <w:sz w:val="26"/>
+        </w:rPr>
+        <w:t>ÎNTREBAREA CONSTRUCȚIEI</w:t>
+      </w:r>
+    </w:p>
+    <w:p>
+      <w:pPr>
+        <w:spacing w:after="80"/>
+      </w:pPr>
+      <w:r>
+        <w:rPr>
+          <w:rFonts w:ascii="Calibri" w:hAnsi="Calibri"/>
+          <w:sz w:val="20"/>
+        </w:rPr>
+        <w:t>Este acesta cu adevărat un tabel?</w:t>
+      </w:r>
+    </w:p>
+    <w:p>
+      <w:pPr>
+        <w:spacing w:before="200" w:after="80"/>
+      </w:pPr>
+      <w:r>
+        <w:rPr>
+          <w:b/>
+          <w:color w:val="000000"/>
+          <w:sz w:val="26"/>
+        </w:rPr>
+        <w:t>DE CE CONTEAZĂ</w:t>
+      </w:r>
+    </w:p>
+    <w:p>
+      <w:pPr>
+        <w:spacing w:after="80"/>
+      </w:pPr>
+      <w:r>
+        <w:rPr>
+          <w:rFonts w:ascii="Calibri" w:hAnsi="Calibri"/>
+          <w:sz w:val="20"/>
+        </w:rPr>
+        <w:t>Un export poate avea aspectul unui tabel Excel și totuși să încalce regulile fundamentale ale unei structuri controlabile. Dacă fundația este greșită, toate construcțiile ulterioare moștenesc eroarea.</w:t>
+      </w:r>
+    </w:p>
+    <w:p>
+      <w:pPr>
+        <w:spacing w:before="200" w:after="80"/>
+      </w:pPr>
+      <w:r>
+        <w:rPr>
+          <w:b/>
+          <w:color w:val="000000"/>
+          <w:sz w:val="26"/>
+        </w:rPr>
+        <w:t>ÎNAINTE</w:t>
+      </w:r>
+    </w:p>
+    <w:p>
+      <w:pPr>
+        <w:spacing w:after="80"/>
+      </w:pPr>
+      <w:r>
+        <w:rPr>
+          <w:rFonts w:ascii="Calibri" w:hAnsi="Calibri"/>
+          <w:sz w:val="20"/>
+        </w:rPr>
+        <w:t>• subtotaluri amestecate cu date</w:t>
+      </w:r>
+    </w:p>
+    <w:p>
+      <w:pPr>
+        <w:spacing w:after="80"/>
+      </w:pPr>
+      <w:r>
+        <w:rPr>
+          <w:rFonts w:ascii="Calibri" w:hAnsi="Calibri"/>
+          <w:sz w:val="20"/>
+        </w:rPr>
+        <w:t>• celule unite</w:t>
+      </w:r>
+    </w:p>
+    <w:p>
+      <w:pPr>
+        <w:spacing w:after="80"/>
+      </w:pPr>
+      <w:r>
+        <w:rPr>
+          <w:rFonts w:ascii="Calibri" w:hAnsi="Calibri"/>
+          <w:sz w:val="20"/>
+        </w:rPr>
+        <w:t>• coloane ascunse</w:t>
+      </w:r>
+    </w:p>
+    <w:p>
+      <w:pPr>
+        <w:spacing w:after="80"/>
+      </w:pPr>
+      <w:r>
+        <w:rPr>
+          <w:rFonts w:ascii="Calibri" w:hAnsi="Calibri"/>
+          <w:sz w:val="20"/>
+        </w:rPr>
+        <w:t>• separatoare artificiale</w:t>
+      </w:r>
+    </w:p>
+    <w:p>
+      <w:pPr>
+        <w:spacing w:before="200" w:after="80"/>
+      </w:pPr>
+      <w:r>
+        <w:rPr>
+          <w:b/>
+          <w:color w:val="000000"/>
+          <w:sz w:val="26"/>
+        </w:rPr>
+        <w:t>DUPĂ</w:t>
+      </w:r>
+    </w:p>
+    <w:p>
+      <w:pPr>
+        <w:spacing w:after="80"/>
+      </w:pPr>
+      <w:r>
+        <w:rPr>
+          <w:rFonts w:ascii="Calibri" w:hAnsi="Calibri"/>
+          <w:sz w:val="20"/>
+        </w:rPr>
+        <w:t>• tabel valid</w:t>
+      </w:r>
+    </w:p>
+    <w:p>
+      <w:pPr>
+        <w:spacing w:after="80"/>
+      </w:pPr>
+      <w:r>
+        <w:rPr>
+          <w:rFonts w:ascii="Calibri" w:hAnsi="Calibri"/>
+          <w:sz w:val="20"/>
+        </w:rPr>
+        <w:t>• structură continuă</w:t>
+      </w:r>
+    </w:p>
+    <w:p>
+      <w:pPr>
+        <w:spacing w:after="80"/>
+      </w:pPr>
+      <w:r>
+        <w:rPr>
+          <w:rFonts w:ascii="Calibri" w:hAnsi="Calibri"/>
+          <w:sz w:val="20"/>
+        </w:rPr>
+        <w:t>• bază pentru formule</w:t>
+      </w:r>
+    </w:p>
+    <w:p>
+      <w:pPr>
+        <w:spacing w:after="80"/>
+      </w:pPr>
+      <w:r>
+        <w:rPr>
+          <w:rFonts w:ascii="Calibri" w:hAnsi="Calibri"/>
+          <w:sz w:val="20"/>
+        </w:rPr>
+        <w:t>• bază pentru Power Query</w:t>
+      </w:r>
+    </w:p>
+    <w:p>
+      <w:pPr>
+        <w:spacing w:before="200" w:after="80"/>
+      </w:pPr>
+      <w:r>
+        <w:rPr>
+          <w:b/>
+          <w:color w:val="000000"/>
+          <w:sz w:val="26"/>
+        </w:rPr>
+        <w:t>CE VEI OBȚINE</w:t>
+      </w:r>
+    </w:p>
+    <w:p>
+      <w:pPr>
+        <w:spacing w:after="80"/>
+      </w:pPr>
+      <w:r>
+        <w:rPr>
+          <w:rFonts w:ascii="Calibri" w:hAnsi="Calibri"/>
+          <w:sz w:val="20"/>
+        </w:rPr>
+        <w:t>✓ structură controlabilă</w:t>
+      </w:r>
+    </w:p>
+    <w:p>
+      <w:pPr>
+        <w:spacing w:after="80"/>
+      </w:pPr>
+      <w:r>
+        <w:rPr>
+          <w:rFonts w:ascii="Calibri" w:hAnsi="Calibri"/>
+          <w:sz w:val="20"/>
+        </w:rPr>
+        <w:t>✓ tabel validat</w:t>
+      </w:r>
+    </w:p>
+    <w:p>
+      <w:pPr>
+        <w:spacing w:after="80"/>
+      </w:pPr>
+      <w:r>
+        <w:rPr>
+          <w:rFonts w:ascii="Calibri" w:hAnsi="Calibri"/>
+          <w:sz w:val="20"/>
+        </w:rPr>
+        <w:t>✓ bază pentru T1 complet</w:t>
+      </w:r>
+    </w:p>
+    <w:p>
+      <w:pPr>
+        <w:spacing w:after="80"/>
+      </w:pPr>
+      <w:r>
+        <w:rPr>
+          <w:rFonts w:ascii="Calibri" w:hAnsi="Calibri"/>
+          <w:sz w:val="20"/>
+        </w:rPr>
+        <w:t>✓ bază pentru T2</w:t>
       </w:r>
     </w:p>
     <w:p>

</xml_diff>

<commit_message>
feat(c01): SPEC v2.0 FILM 'Biblia' - 4 sectiuni + ARSENAL/TRANSFORMARE in Study
FILM C01 restructurat in 4 sectiuni (IDENTITATE / ARSENAL NARATIV / BRIEF PEDAGOGIC
/ TRANSFORMAREA CURSANTULUI), micro-brief mutat in Brief, +Simptom/Greseala/Aha/
Fraza-trailer(promovata)/Competenta/De-acum-inainte.
Study C01: .arsenal-band (aha+greseala+simptom) dupa hero + .transformare-section
(competenta + de acum inainte) la inchidere.
Documentat SPEC v2.0 + rutare in 10-MAP-FILM-HTML.md. Prototip pentru reactie.
</commit_message>
<xml_diff>
--- a/c01/FILM-Excel-01-Structurare.docx
+++ b/c01/FILM-Excel-01-Structurare.docx
@@ -37,9 +37,6 @@
       </w:r>
     </w:p>
     <w:p>
-      <w:pPr>
-        <w:spacing w:before="240" w:after="160"/>
-      </w:pPr>
       <w:r>
         <w:rPr>
           <w:b/>
@@ -72,31 +69,6 @@
           <w:sz w:val="20"/>
         </w:rPr>
         <w:t>Arată ca tabel. Nu este unul.</w:t>
-      </w:r>
-    </w:p>
-    <w:p>
-      <w:pPr>
-        <w:spacing w:before="200" w:after="80"/>
-      </w:pPr>
-      <w:r>
-        <w:rPr>
-          <w:b/>
-          <w:color w:val="000000"/>
-          <w:sz w:val="26"/>
-        </w:rPr>
-        <w:t>MICRO-BRIEF</w:t>
-      </w:r>
-    </w:p>
-    <w:p>
-      <w:pPr>
-        <w:spacing w:after="80"/>
-      </w:pPr>
-      <w:r>
-        <w:rPr>
-          <w:rFonts w:ascii="Calibri" w:hAnsi="Calibri"/>
-          <w:sz w:val="20"/>
-        </w:rPr>
-        <w:t>Un export poate avea aspectul unui tabel Excel și totuși să nu respecte regulile unui tabel real. În această construcție demonstrăm diferența dintre aparență și structură.</w:t>
       </w:r>
     </w:p>
     <w:p>
@@ -206,7 +178,153 @@
           <w:color w:val="000000"/>
           <w:sz w:val="32"/>
         </w:rPr>
-        <w:t>BRIEF STUDIU · PEDAGOGIC</w:t>
+        <w:t>ARSENAL NARATIV</w:t>
+      </w:r>
+    </w:p>
+    <w:p>
+      <w:pPr>
+        <w:spacing w:before="200" w:after="80"/>
+      </w:pPr>
+      <w:r>
+        <w:rPr>
+          <w:b/>
+          <w:color w:val="000000"/>
+          <w:sz w:val="26"/>
+        </w:rPr>
+        <w:t>SIMPTOM ÎN BUSINESS</w:t>
+      </w:r>
+    </w:p>
+    <w:p>
+      <w:pPr>
+        <w:spacing w:after="80"/>
+      </w:pPr>
+      <w:r>
+        <w:rPr>
+          <w:rFonts w:ascii="Calibri" w:hAnsi="Calibri"/>
+          <w:sz w:val="20"/>
+        </w:rPr>
+        <w:t>• rapoarte diferite pe același fișier</w:t>
+      </w:r>
+    </w:p>
+    <w:p>
+      <w:pPr>
+        <w:spacing w:after="80"/>
+      </w:pPr>
+      <w:r>
+        <w:rPr>
+          <w:rFonts w:ascii="Calibri" w:hAnsi="Calibri"/>
+          <w:sz w:val="20"/>
+        </w:rPr>
+        <w:t>• sume care nu coincid de la o filtrare la alta</w:t>
+      </w:r>
+    </w:p>
+    <w:p>
+      <w:pPr>
+        <w:spacing w:after="80"/>
+      </w:pPr>
+      <w:r>
+        <w:rPr>
+          <w:rFonts w:ascii="Calibri" w:hAnsi="Calibri"/>
+          <w:sz w:val="20"/>
+        </w:rPr>
+        <w:t>• filtre care ascund tranzacții fără să te avertizeze</w:t>
+      </w:r>
+    </w:p>
+    <w:p>
+      <w:pPr>
+        <w:spacing w:after="80"/>
+      </w:pPr>
+      <w:r>
+        <w:rPr>
+          <w:rFonts w:ascii="Calibri" w:hAnsi="Calibri"/>
+          <w:sz w:val="20"/>
+        </w:rPr>
+        <w:t>• un total general numărat ca rând de date</w:t>
+      </w:r>
+    </w:p>
+    <w:p>
+      <w:pPr>
+        <w:spacing w:before="200" w:after="80"/>
+      </w:pPr>
+      <w:r>
+        <w:rPr>
+          <w:b/>
+          <w:color w:val="000000"/>
+          <w:sz w:val="26"/>
+        </w:rPr>
+        <w:t>GREȘEALA CLASICĂ</w:t>
+      </w:r>
+    </w:p>
+    <w:p>
+      <w:pPr>
+        <w:spacing w:after="80"/>
+      </w:pPr>
+      <w:r>
+        <w:rPr>
+          <w:rFonts w:ascii="Calibri" w:hAnsi="Calibri"/>
+          <w:sz w:val="20"/>
+        </w:rPr>
+        <w:t>Oamenii încep cu formulele. Profesioniștii încep cu structura.</w:t>
+      </w:r>
+    </w:p>
+    <w:p>
+      <w:pPr>
+        <w:spacing w:before="200" w:after="80"/>
+      </w:pPr>
+      <w:r>
+        <w:rPr>
+          <w:b/>
+          <w:color w:val="000000"/>
+          <w:sz w:val="26"/>
+        </w:rPr>
+        <w:t>AHA MOMENT</w:t>
+      </w:r>
+    </w:p>
+    <w:p>
+      <w:pPr>
+        <w:spacing w:after="80"/>
+      </w:pPr>
+      <w:r>
+        <w:rPr>
+          <w:rFonts w:ascii="Calibri" w:hAnsi="Calibri"/>
+          <w:sz w:val="20"/>
+        </w:rPr>
+        <w:t>Nu există formule corecte peste o structură greșită.</w:t>
+      </w:r>
+    </w:p>
+    <w:p>
+      <w:pPr>
+        <w:spacing w:before="200" w:after="80"/>
+      </w:pPr>
+      <w:r>
+        <w:rPr>
+          <w:b/>
+          <w:color w:val="000000"/>
+          <w:sz w:val="26"/>
+        </w:rPr>
+        <w:t>FRAZA DE TRAILER (promovată din AHA MOMENT)</w:t>
+      </w:r>
+    </w:p>
+    <w:p>
+      <w:pPr>
+        <w:spacing w:after="80"/>
+      </w:pPr>
+      <w:r>
+        <w:rPr>
+          <w:rFonts w:ascii="Calibri" w:hAnsi="Calibri"/>
+          <w:sz w:val="20"/>
+        </w:rPr>
+        <w:t>Nu există formule corecte peste o structură greșită.</w:t>
+      </w:r>
+    </w:p>
+    <w:p>
+      <w:r>
+        <w:rPr>
+          <w:b/>
+          <w:color w:val="000000"/>
+          <w:sz w:val="32"/>
+        </w:rPr>
+        <w:t>BRIEF PEDAGOGIC</w:t>
       </w:r>
     </w:p>
     <w:p>
@@ -244,6 +362,31 @@
           <w:color w:val="000000"/>
           <w:sz w:val="26"/>
         </w:rPr>
+        <w:t>MICRO-BRIEF</w:t>
+      </w:r>
+    </w:p>
+    <w:p>
+      <w:pPr>
+        <w:spacing w:after="80"/>
+      </w:pPr>
+      <w:r>
+        <w:rPr>
+          <w:rFonts w:ascii="Calibri" w:hAnsi="Calibri"/>
+          <w:sz w:val="20"/>
+        </w:rPr>
+        <w:t>Un export poate avea aspectul unui tabel Excel și totuși să nu respecte regulile unui tabel real. În această construcție demonstrăm diferența dintre aparență și structură.</w:t>
+      </w:r>
+    </w:p>
+    <w:p>
+      <w:pPr>
+        <w:spacing w:before="200" w:after="80"/>
+      </w:pPr>
+      <w:r>
+        <w:rPr>
+          <w:b/>
+          <w:color w:val="000000"/>
+          <w:sz w:val="26"/>
+        </w:rPr>
         <w:t>DE CE CONTEAZĂ</w:t>
       </w:r>
     </w:p>
@@ -440,6 +583,90 @@
           <w:sz w:val="20"/>
         </w:rPr>
         <w:t>✓ bază pentru T2</w:t>
+      </w:r>
+    </w:p>
+    <w:p>
+      <w:r>
+        <w:rPr>
+          <w:b/>
+          <w:color w:val="000000"/>
+          <w:sz w:val="32"/>
+        </w:rPr>
+        <w:t>TRANSFORMAREA CURSANTULUI</w:t>
+      </w:r>
+    </w:p>
+    <w:p>
+      <w:pPr>
+        <w:spacing w:before="200" w:after="80"/>
+      </w:pPr>
+      <w:r>
+        <w:rPr>
+          <w:b/>
+          <w:color w:val="000000"/>
+          <w:sz w:val="26"/>
+        </w:rPr>
+        <w:t>COMPETENȚA DOBÂNDITĂ</w:t>
+      </w:r>
+    </w:p>
+    <w:p>
+      <w:pPr>
+        <w:spacing w:after="80"/>
+      </w:pPr>
+      <w:r>
+        <w:rPr>
+          <w:rFonts w:ascii="Calibri" w:hAnsi="Calibri"/>
+          <w:sz w:val="20"/>
+        </w:rPr>
+        <w:t>Poți identifica în mai puțin de 30 de secunde dacă un export ERP este utilizabil sau trebuie restructurat înainte de analiză.</w:t>
+      </w:r>
+    </w:p>
+    <w:p>
+      <w:pPr>
+        <w:spacing w:before="200" w:after="80"/>
+      </w:pPr>
+      <w:r>
+        <w:rPr>
+          <w:b/>
+          <w:color w:val="000000"/>
+          <w:sz w:val="26"/>
+        </w:rPr>
+        <w:t>DE ACUM ÎNAINTE</w:t>
+      </w:r>
+    </w:p>
+    <w:p>
+      <w:pPr>
+        <w:spacing w:after="80"/>
+      </w:pPr>
+      <w:r>
+        <w:rPr>
+          <w:rFonts w:ascii="Calibri" w:hAnsi="Calibri"/>
+          <w:sz w:val="20"/>
+        </w:rPr>
+        <w:t>Nu mai vezi tabele. Vezi structuri.</w:t>
+      </w:r>
+    </w:p>
+    <w:p>
+      <w:pPr>
+        <w:spacing w:after="80"/>
+      </w:pPr>
+      <w:r>
+        <w:rPr>
+          <w:rFonts w:ascii="Calibri" w:hAnsi="Calibri"/>
+          <w:sz w:val="20"/>
+        </w:rPr>
+        <w:t>Nu mai verifici cifre. Verifici fundația.</w:t>
+      </w:r>
+    </w:p>
+    <w:p>
+      <w:pPr>
+        <w:spacing w:after="80"/>
+      </w:pPr>
+      <w:r>
+        <w:rPr>
+          <w:rFonts w:ascii="Calibri" w:hAnsi="Calibri"/>
+          <w:sz w:val="20"/>
+        </w:rPr>
+        <w:t>Nu mai întrebi „ce formulă folosesc?". Întrebi „pe ce structură construiesc?".</w:t>
       </w:r>
     </w:p>
     <w:p>

</xml_diff>

<commit_message>
feat(c01)+docs(brain): FILM Biblie complet (CINE DEVII) + consolidare V47
FILM C01: adaugat CINE DEVII (promisiune-bookend) in TRANSFORMARE -> Biblia SPEC v2.0 completa.
Mapare 10-MAP: documentat modelul experienta C01 validat (hero cockpit + arc 2 voci + bomba + bookend).
STARE-CURENTA + VERSIUNI: consolidare V47 (redesign experienta C01, randator headless, L171/L172).
</commit_message>
<xml_diff>
--- a/c01/FILM-Excel-01-Structurare.docx
+++ b/c01/FILM-Excel-01-Structurare.docx
@@ -593,6 +593,31 @@
           <w:sz w:val="32"/>
         </w:rPr>
         <w:t>TRANSFORMAREA CURSANTULUI</w:t>
+      </w:r>
+    </w:p>
+    <w:p>
+      <w:pPr>
+        <w:spacing w:before="200" w:after="80"/>
+      </w:pPr>
+      <w:r>
+        <w:rPr>
+          <w:b/>
+          <w:color w:val="000000"/>
+          <w:sz w:val="26"/>
+        </w:rPr>
+        <w:t>CINE DEVII (promisiune · bookend)</w:t>
+      </w:r>
+    </w:p>
+    <w:p>
+      <w:pPr>
+        <w:spacing w:after="80"/>
+      </w:pPr>
+      <w:r>
+        <w:rPr>
+          <w:rFonts w:ascii="Calibri" w:hAnsi="Calibri"/>
+          <w:sz w:val="20"/>
+        </w:rPr>
+        <w:t>Nu mai vezi tabele. Vezi structuri.</w:t>
       </w:r>
     </w:p>
     <w:p>

</xml_diff>

<commit_message>
refactor(video-film): align C01-C12 identity with locked SCARA registry
Strat Video (title + topbar-brand) = CUVANT LOCKED; hero-title + anteturi/
semnaturi FILM = MIZA HERO LOCKED. Aplicat pe C01 si C03-C12 (C02 frozen
dupa LOT 1, C04 FILM deja MIZA HERO). Forward-ref reparate: C01->C02
CONFRUNTAREA CU REALITATEA, C11->C12 INTERPRETAREA REZULTATELOR.

Nimic atins din Studiu/Editor-Studiu/sistem/xlsx; zero schimbari de
hook/AHA/payoff/pasi/educational. gate_v20 PASS pe toate 11.

Drift rezidual audit_sync (raportat): R-V58.filmname XX pe C08/C09/C11 —
detectorul leaga numele FILM de footer/topbar/cover-title Studiu, nu de
hov-object (unde traieste acum MIZA HERO). Necesita decizie separata
(footer Studiu sau update detector). C12 V39.assets = pre-existent.
</commit_message>
<xml_diff>
--- a/c01/FILM-Excel-01-Structurare.docx
+++ b/c01/FILM-Excel-01-Structurare.docx
@@ -9,7 +9,7 @@
           <w:color w:val="000000"/>
           <w:sz w:val="44"/>
         </w:rPr>
-        <w:t>FILM · C01 STRUCTURA TABELELOR</w:t>
+        <w:t>FILM · C01 STRUCTURAREA TABELELOR</w:t>
       </w:r>
     </w:p>
     <w:p>
@@ -2759,7 +2759,7 @@
           <w:rFonts w:ascii="Calibri" w:hAnsi="Calibri"/>
           <w:sz w:val="20"/>
         </w:rPr>
-        <w:t>Predat către C02 CONTROLUL DATELOR.</w:t>
+        <w:t>Predat către C02 CONFRUNTAREA CU REALITATEA.</w:t>
       </w:r>
     </w:p>
     <w:sectPr>

</xml_diff>